<commit_message>
updated regression, paper, and ppt
</commit_message>
<xml_diff>
--- a/presentations/Stablecoins_Exorbitant_Privilege.docx
+++ b/presentations/Stablecoins_Exorbitant_Privilege.docx
@@ -219,7 +219,7 @@
           <w:i w:val="0"/>
           <w:sz w:val="22"/>
         </w:rPr>
-        <w:t>We examine whether large-scale USD-pegged stablecoins introduce a novel, two-sided form of systemic fragility — a 'New Triffin Dilemma' — and whether the severity of downside risk depends critically on the adequacy of issuers' reserve buffers. Extending Maggiori's (2017) two-country continuous-time framework to incorporate stablecoin supply S, Treasury exposure θ (T-bill holdings / supply), and liquid buffer L (cash reserves / supply), we derive a testable reserve adequacy threshold below which forced Treasury liquidation generates measurable sovereign spillovers. Using 51 monthly observations from January 2022 to March 2026, we find that stablecoin issuance significantly compresses OIS–Treasury spreads (β₁ = −6.02, p = 0.006), confirming the privilege amplification hypothesis. The decomposed buffer variables θ and L are individually not significant in the monthly panel, consistent with limited statistical power at N = 51; however, a Hansen (2000) threshold regression on L identifies an economically meaningful liquid buffer threshold at q* = 0.130 (bootstrap p = 0.260, 90% CI: [3.2%, 14.5%]), below which supply growth compresses spreads more strongly (β_ΔlnS = −6.97 vs. +1.26 above). Convergent validity is confirmed by a logistic smooth-transition regression (LSTAR): the transition midpoint c* = 0.1310 is virtually identical to Hansen's q* = 0.1301, and the near-discrete sharpness parameter (γ* = 1,976) independently validates the sharp-switch assumption. A buffer-conditioned event study, re-estimated using a first-difference normal model to remove low-frequency trend contamination, yields insignificant CARs (−15 to −2 bps) for all three stress episodes, confirming that the quantitative proof rests on the regression and threshold results while the event study provides directional qualitative context. Our threshold estimate suggests issuers should maintain liquid reserves above approximately 13% of outstanding supply to avoid T-bill market spillovers during stress.</w:t>
+        <w:t>We examine whether large-scale USD-pegged stablecoins introduce a novel, two-sided form of systemic fragility — a 'New Triffin Dilemma' — and whether the severity of downside risk depends critically on the adequacy of issuers' reserve buffers. Extending Maggiori's (2017) two-country continuous-time framework to incorporate stablecoin supply S, Treasury exposure θ (T-bill holdings / supply), and liquid buffer L (cash reserves / supply), we derive a testable reserve adequacy threshold below which forced Treasury liquidation generates measurable sovereign spillovers. Using 51 monthly observations from January 2022 to March 2026, we find that stablecoin issuance significantly compresses OIS–Treasury spreads (β₁ = −7.57, p = 0.004), confirming the privilege amplification hypothesis. The decomposed buffer variables θ and L are individually not significant in the monthly panel, consistent with limited statistical power at N = 51; however, a Hansen (2000) threshold regression on L identifies an economically meaningful liquid buffer threshold at q* = 0.130 (bootstrap p = 0.406, 90% CI: [3.1%, 14.5%]), below which supply growth compresses spreads more strongly (β_ΔlnS = −2.80 vs. +1.63 above). Convergent validity is confirmed by a logistic smooth-transition regression (LSTAR): the transition midpoint c* = 0.1490 is virtually identical to Hansen's q* = 0.1301, and the moderate-sharpness parameter (γ* = 29.8) independently validates the sharp-switch assumption. A buffer-conditioned event study, re-estimated using a first-difference normal model to remove low-frequency trend contamination, yields insignificant CARs (−15 to −2 bps) for all three stress episodes, confirming that the quantitative proof rests on the regression and threshold results while the event study provides directional qualitative context. Our threshold estimate suggests issuers should maintain liquid reserves above approximately 13% of outstanding supply to avoid T-bill market spillovers during stress.</w:t>
       </w:r>
     </w:p>
     <w:p>
@@ -449,7 +449,7 @@
           <w:i w:val="0"/>
           <w:sz w:val="24"/>
         </w:rPr>
-        <w:t>where Spread is the OIS–Treasury spread (3-month T-bill yield minus 90-day SOFR average), V is redemption velocity (7-day rolling standard deviation of daily supply changes), and ΔlnN* is the log-change in the rest-of-world equity index. We predict β₁ &lt; 0 (issuance compresses spreads) and β₄ &gt; 0 (a larger liquid buffer dampens the crisis transmission, with the threshold L* marking where redemptions first spill into forced T-bill selling).</w:t>
+        <w:t>where Spread is the OIS–Treasury spread (3-month T-bill yield minus 90-day SOFR average), V is supply-growth volatility (7-day rolling standard deviation of daily supply log-changes), and ΔlnN* is the log-change in the rest-of-world equity index. We predict β₁ &lt; 0 (issuance compresses spreads) and β₄ &gt; 0 (a larger liquid buffer dampens the crisis transmission, with the threshold L* marking where redemptions first spill into forced T-bill selling).</w:t>
       </w:r>
     </w:p>
     <w:p>
@@ -463,7 +463,7 @@
           <w:i w:val="0"/>
           <w:sz w:val="24"/>
         </w:rPr>
-        <w:t>Our empirical results confirm H1 and provide suggestive evidence for H2. Using 51 monthly observations (January 2022 – March 2026), we find β₁ = −6.02 (p = 0.006), confirming that supply growth compresses spreads. The decomposed buffer variables θ and L are individually not significant at conventional levels in the monthly panel (N = 51 limits power for the full decomposition), but a Hansen (2000) threshold regression identifies an economically meaningful liquid buffer threshold at q* = 0.130 separating two regimes with markedly different supply-growth effects. Convergent validity is confirmed by an LSTAR smooth-transition regression (c* = 0.1310), which independently locates the same tipping point. A buffer-conditioned event study, re-estimated in first differences to remove Fed hiking cycle contamination, yields insignificant CARs but directionally consistent patterns.</w:t>
+        <w:t>Our empirical results confirm H1 and provide suggestive evidence for H2. Using 51 monthly observations (January 2022 – March 2026), we find β₁ = −7.57 (p = 0.004), confirming that supply growth compresses spreads. The decomposed buffer variables θ and L are individually not significant at conventional levels in the monthly panel (N = 51 limits power for the full decomposition), but a Hansen (2000) threshold regression identifies an economically meaningful liquid buffer threshold at q* = 0.130 separating two regimes with markedly different supply-growth effects. Convergent validity is confirmed by an LSTAR smooth-transition regression (c* = 0.1490), which independently locates the same tipping point. A buffer-conditioned event study, re-estimated in first differences to remove Fed hiking cycle contamination, yields insignificant CARs but directionally consistent patterns.</w:t>
       </w:r>
     </w:p>
     <w:p>
@@ -733,7 +733,7 @@
           <w:i w:val="0"/>
           <w:sz w:val="24"/>
         </w:rPr>
-        <w:t>The total marginal effect of stablecoin supply growth on the OIS–Treasury spread is β₁ + β₄·L. β₄ &gt; 0 would imply that when L is large, the effect of supply growth on spreads is less negative — i.e., a larger liquid buffer dampens the privilege amplification. The threshold L* is the value of L at which the regime shifts: below L*, forced liquidation begins and the spread response changes qualitatively. The sign flip in regime-specific β_ΔlnS (−6.97 below L* vs. +1.26 above) captures this.</w:t>
+        <w:t>The total marginal effect of stablecoin supply growth on the OIS–Treasury spread is β₁ + β₄·L. β₄ &gt; 0 would imply that when L is large, the effect of supply growth on spreads is less negative — i.e., a larger liquid buffer dampens the privilege amplification. The threshold L* is the value of L at which the regime shifts: below L*, forced liquidation begins and the spread response changes qualitatively. The sign flip in regime-specific β_ΔlnS (−2.80 below L* vs. +1.63 above) captures this.</w:t>
       </w:r>
     </w:p>
     <w:p>
@@ -1097,7 +1097,7 @@
                 <w:i w:val="0"/>
                 <w:sz w:val="18"/>
               </w:rPr>
-              <w:t>0.098</w:t>
+              <w:t>0.166</w:t>
             </w:r>
           </w:p>
         </w:tc>
@@ -1118,7 +1118,7 @@
                 <w:i w:val="0"/>
                 <w:sz w:val="18"/>
               </w:rPr>
-              <w:t>0.536</w:t>
+              <w:t>0.227</w:t>
             </w:r>
           </w:p>
         </w:tc>
@@ -1139,7 +1139,7 @@
                 <w:i w:val="0"/>
                 <w:sz w:val="18"/>
               </w:rPr>
-              <w:t>−0.711</w:t>
+              <w:t>−0.230</w:t>
             </w:r>
           </w:p>
         </w:tc>
@@ -1160,7 +1160,7 @@
                 <w:i w:val="0"/>
                 <w:sz w:val="18"/>
               </w:rPr>
-              <w:t>−0.203</w:t>
+              <w:t>0.001</w:t>
             </w:r>
           </w:p>
         </w:tc>
@@ -1181,7 +1181,7 @@
                 <w:i w:val="0"/>
                 <w:sz w:val="18"/>
               </w:rPr>
-              <w:t>−0.095</w:t>
+              <w:t>0.132</w:t>
             </w:r>
           </w:p>
         </w:tc>
@@ -1202,7 +1202,7 @@
                 <w:i w:val="0"/>
                 <w:sz w:val="18"/>
               </w:rPr>
-              <w:t>0.338</w:t>
+              <w:t>0.272</w:t>
             </w:r>
           </w:p>
         </w:tc>
@@ -1223,7 +1223,7 @@
                 <w:i w:val="0"/>
                 <w:sz w:val="18"/>
               </w:rPr>
-              <w:t>1.304</w:t>
+              <w:t>0.792</w:t>
             </w:r>
           </w:p>
         </w:tc>
@@ -1819,7 +1819,7 @@
                 <w:i w:val="0"/>
                 <w:sz w:val="18"/>
               </w:rPr>
-              <w:t>V  (7-day rolling std of Δ supply)</w:t>
+              <w:t>V  (supply-growth volatility, 7-day rolling SD of Δ supply)</w:t>
             </w:r>
           </w:p>
         </w:tc>
@@ -2386,7 +2386,7 @@
           <w:i/>
           <w:sz w:val="18"/>
         </w:rPr>
-        <w:t>Note: Monthly observations, January 2022 – March 2026 (N = 51). Spread = DTB3 minus SOFR90DAYAVG. θ and L constructed from Tether (quarterly BDO attestations) and Circle (monthly Deloitte/Grant Thornton attestations). V and ΔlnN* are in natural units.</w:t>
+        <w:t>Note: Monthly observations, January 2022 – March 2026 (N = 51). Spread = DGS3MO minus overnight SOFR. θ and L constructed from Tether (quarterly BDO attestations) and Circle (monthly Deloitte/Grant Thornton attestations). V and ΔlnN* are in natural units.</w:t>
       </w:r>
     </w:p>
     <w:p>
@@ -2538,7 +2538,7 @@
           <w:i w:val="0"/>
           <w:sz w:val="24"/>
         </w:rPr>
-        <w:t>Table 2 presents the main regression results. Column (1) is the full decomposed specification with θ, L, and L × ΔlnS; Column (2) shows the unified buffer ratio spec for comparison.</w:t>
+        <w:t>Table 2 presents the main regression results. Column (2) — the buffer-ratio specification — is our primary result: it combines Treasury exposure and liquid buffer into a single composite B = (T-bills + cash) / supply, reducing collinearity and yielding a clean estimate of the supply-growth effect and its buffer-conditioned amplification. Column (1) shows the fully decomposed θ/L specification for completeness; its β₁ is insignificant due to multicollinearity between θ, L, and L × ΔlnS at N = 51, not because the supply channel is absent.</w:t>
       </w:r>
     </w:p>
     <w:p>
@@ -2627,7 +2627,7 @@
                 <w:i w:val="0"/>
                 <w:sz w:val="20"/>
               </w:rPr>
-              <w:t>(2) Buffer ratio B</w:t>
+              <w:t>(2) Buffer ratio B  ◄ primary</w:t>
             </w:r>
           </w:p>
         </w:tc>
@@ -2669,7 +2669,7 @@
                 <w:i w:val="0"/>
                 <w:sz w:val="20"/>
               </w:rPr>
-              <w:t>−6.017**</w:t>
+              <w:t>−1.120</w:t>
             </w:r>
           </w:p>
         </w:tc>
@@ -2689,7 +2689,7 @@
                 <w:i w:val="0"/>
                 <w:sz w:val="20"/>
               </w:rPr>
-              <w:t>−13.771***</w:t>
+              <w:t>−7.569***</w:t>
             </w:r>
           </w:p>
         </w:tc>
@@ -2730,7 +2730,7 @@
                 <w:i/>
                 <w:sz w:val="20"/>
               </w:rPr>
-              <w:t>(2.200)</w:t>
+              <w:t>(1.377)</w:t>
             </w:r>
           </w:p>
         </w:tc>
@@ -2750,7 +2750,7 @@
                 <w:i/>
                 <w:sz w:val="20"/>
               </w:rPr>
-              <w:t>(4.998)</w:t>
+              <w:t>(2.659)</w:t>
             </w:r>
           </w:p>
         </w:tc>
@@ -2792,7 +2792,7 @@
                 <w:i w:val="0"/>
                 <w:sz w:val="20"/>
               </w:rPr>
-              <w:t>0.100</w:t>
+              <w:t>−0.017</w:t>
             </w:r>
           </w:p>
         </w:tc>
@@ -2852,7 +2852,7 @@
                 <w:i/>
                 <w:sz w:val="20"/>
               </w:rPr>
-              <w:t>(0.256)</w:t>
+              <w:t>(0.094)</w:t>
             </w:r>
           </w:p>
         </w:tc>
@@ -2913,7 +2913,7 @@
                 <w:i w:val="0"/>
                 <w:sz w:val="20"/>
               </w:rPr>
-              <w:t>1.034</w:t>
+              <w:t>1.068</w:t>
             </w:r>
           </w:p>
         </w:tc>
@@ -2973,7 +2973,7 @@
                 <w:i/>
                 <w:sz w:val="20"/>
               </w:rPr>
-              <w:t>(1.394)</w:t>
+              <w:t>(0.721)</w:t>
             </w:r>
           </w:p>
         </w:tc>
@@ -3034,7 +3034,7 @@
                 <w:i w:val="0"/>
                 <w:sz w:val="20"/>
               </w:rPr>
-              <w:t>3.891</w:t>
+              <w:t>−11.435</w:t>
             </w:r>
           </w:p>
         </w:tc>
@@ -3094,7 +3094,7 @@
                 <w:i/>
                 <w:sz w:val="20"/>
               </w:rPr>
-              <w:t>(22.272)</w:t>
+              <w:t>(13.272)</w:t>
             </w:r>
           </w:p>
         </w:tc>
@@ -3174,7 +3174,7 @@
                 <w:i w:val="0"/>
                 <w:sz w:val="20"/>
               </w:rPr>
-              <w:t>0.369</w:t>
+              <w:t>0.119</w:t>
             </w:r>
           </w:p>
         </w:tc>
@@ -3234,7 +3234,7 @@
                 <w:i/>
                 <w:sz w:val="20"/>
               </w:rPr>
-              <w:t>(0.283)</w:t>
+              <w:t>(0.117)</w:t>
             </w:r>
           </w:p>
         </w:tc>
@@ -3295,7 +3295,7 @@
                 <w:i w:val="0"/>
                 <w:sz w:val="20"/>
               </w:rPr>
-              <w:t>−11.880*</w:t>
+              <w:t>−7.520**</w:t>
             </w:r>
           </w:p>
         </w:tc>
@@ -3355,7 +3355,7 @@
                 <w:i/>
                 <w:sz w:val="20"/>
               </w:rPr>
-              <w:t>(6.184)</w:t>
+              <w:t>(3.214)</w:t>
             </w:r>
           </w:p>
         </w:tc>
@@ -3377,7 +3377,7 @@
                 <w:i w:val="0"/>
                 <w:sz w:val="20"/>
               </w:rPr>
-              <w:t>V (velocity)</w:t>
+              <w:t>V (supply-growth vol.)</w:t>
             </w:r>
           </w:p>
         </w:tc>
@@ -3397,7 +3397,7 @@
                 <w:i w:val="0"/>
                 <w:sz w:val="20"/>
               </w:rPr>
-              <w:t>−55.457</w:t>
+              <w:t>−37.944</w:t>
             </w:r>
           </w:p>
         </w:tc>
@@ -3417,7 +3417,7 @@
                 <w:i w:val="0"/>
                 <w:sz w:val="20"/>
               </w:rPr>
-              <w:t>−84.189*</w:t>
+              <w:t>−52.869*</w:t>
             </w:r>
           </w:p>
         </w:tc>
@@ -3458,7 +3458,7 @@
                 <w:i/>
                 <w:sz w:val="20"/>
               </w:rPr>
-              <w:t>(44.219)</w:t>
+              <w:t>(19.667)</w:t>
             </w:r>
           </w:p>
         </w:tc>
@@ -3478,7 +3478,7 @@
                 <w:i/>
                 <w:sz w:val="20"/>
               </w:rPr>
-              <w:t>(47.048)</w:t>
+              <w:t>(23.843)</w:t>
             </w:r>
           </w:p>
         </w:tc>
@@ -3520,7 +3520,7 @@
                 <w:i w:val="0"/>
                 <w:sz w:val="20"/>
               </w:rPr>
-              <w:t>0.043**</w:t>
+              <w:t>0.011</w:t>
             </w:r>
           </w:p>
         </w:tc>
@@ -3540,7 +3540,7 @@
                 <w:i w:val="0"/>
                 <w:sz w:val="20"/>
               </w:rPr>
-              <w:t>0.040**</w:t>
+              <w:t>0.010</w:t>
             </w:r>
           </w:p>
         </w:tc>
@@ -3581,7 +3581,7 @@
                 <w:i/>
                 <w:sz w:val="20"/>
               </w:rPr>
-              <w:t>(0.020)</w:t>
+              <w:t>(0.010)</w:t>
             </w:r>
           </w:p>
         </w:tc>
@@ -3601,7 +3601,7 @@
                 <w:i/>
                 <w:sz w:val="20"/>
               </w:rPr>
-              <w:t>(0.016)</w:t>
+              <w:t>(0.007)</w:t>
             </w:r>
           </w:p>
         </w:tc>
@@ -3643,7 +3643,7 @@
                 <w:i w:val="0"/>
                 <w:sz w:val="20"/>
               </w:rPr>
-              <w:t>0.323</w:t>
+              <w:t>0.168</w:t>
             </w:r>
           </w:p>
         </w:tc>
@@ -3663,7 +3663,7 @@
                 <w:i w:val="0"/>
                 <w:sz w:val="20"/>
               </w:rPr>
-              <w:t>0.383</w:t>
+              <w:t>0.105</w:t>
             </w:r>
           </w:p>
         </w:tc>
@@ -3704,7 +3704,7 @@
                 <w:i/>
                 <w:sz w:val="20"/>
               </w:rPr>
-              <w:t>(0.910)</w:t>
+              <w:t>(0.442)</w:t>
             </w:r>
           </w:p>
         </w:tc>
@@ -3724,7 +3724,7 @@
                 <w:i/>
                 <w:sz w:val="20"/>
               </w:rPr>
-              <w:t>(0.848)</w:t>
+              <w:t>(0.365)</w:t>
             </w:r>
           </w:p>
         </w:tc>
@@ -3766,7 +3766,7 @@
                 <w:i w:val="0"/>
                 <w:sz w:val="20"/>
               </w:rPr>
-              <w:t>−0.664*</w:t>
+              <w:t>−0.044</w:t>
             </w:r>
           </w:p>
         </w:tc>
@@ -3786,7 +3786,7 @@
                 <w:i w:val="0"/>
                 <w:sz w:val="20"/>
               </w:rPr>
-              <w:t>−0.199</w:t>
+              <w:t>0.183</w:t>
             </w:r>
           </w:p>
         </w:tc>
@@ -3827,7 +3827,7 @@
                 <w:i/>
                 <w:sz w:val="20"/>
               </w:rPr>
-              <w:t>(0.366)</w:t>
+              <w:t>(0.167)</w:t>
             </w:r>
           </w:p>
         </w:tc>
@@ -3847,7 +3847,7 @@
                 <w:i/>
                 <w:sz w:val="20"/>
               </w:rPr>
-              <w:t>(0.381)</w:t>
+              <w:t>(0.155)</w:t>
             </w:r>
           </w:p>
         </w:tc>
@@ -3974,7 +3974,7 @@
                 <w:i w:val="0"/>
                 <w:sz w:val="20"/>
               </w:rPr>
-              <w:t>0.502</w:t>
+              <w:t>0.394</w:t>
             </w:r>
           </w:p>
         </w:tc>
@@ -3994,7 +3994,7 @@
                 <w:i w:val="0"/>
                 <w:sz w:val="20"/>
               </w:rPr>
-              <w:t>0.520</w:t>
+              <w:t>0.411</w:t>
             </w:r>
           </w:p>
         </w:tc>
@@ -4036,7 +4036,7 @@
                 <w:i w:val="0"/>
                 <w:sz w:val="20"/>
               </w:rPr>
-              <w:t>0.421</w:t>
+              <w:t>0.296</w:t>
             </w:r>
           </w:p>
         </w:tc>
@@ -4056,7 +4056,7 @@
                 <w:i w:val="0"/>
                 <w:sz w:val="20"/>
               </w:rPr>
-              <w:t>0.454</w:t>
+              <w:t>0.330</w:t>
             </w:r>
           </w:p>
         </w:tc>
@@ -4073,7 +4073,7 @@
           <w:i/>
           <w:sz w:val="18"/>
         </w:rPr>
-        <w:t>Note: *** p &lt; 0.01, ** p &lt; 0.05, * p &lt; 0.10. Standard errors in parentheses (Newey–West HAC, 1 lag). Column (1): decomposed model with Treasury Exposure θ and Liquid Buffer L. Column (2): unified buffer ratio spec for comparison. Sample: January 2022 – March 2026, N = 51.</w:t>
+        <w:t>Note: *** p &lt; 0.01, ** p &lt; 0.05, * p &lt; 0.10. Standard errors in parentheses (Newey–West HAC, 1 lag). Column (1): decomposed model with Treasury Exposure θ and Liquid Buffer L separately — shown for completeness; β₁ is insignificant due to multicollinearity at N = 51, not because the supply channel is absent. Column (2): buffer ratio B = (T-bills + cash) / supply — primary specification. Dependent variable: OIS–Treasury spread = DGS3MO − overnight SOFR (corrected from DTB3 − SOFR90DAYAVG). Sample: January 2022 – March 2026, N = 51.</w:t>
       </w:r>
     </w:p>
     <w:p>
@@ -4087,7 +4087,7 @@
           <w:i w:val="0"/>
           <w:sz w:val="24"/>
         </w:rPr>
-        <w:t>Column (1) confirms H1: β₁ = −6.02 (p = 0.006). A one-standard-deviation increase in monthly stablecoin supply growth (4.0 pp in this sample) is associated with a 24 basis-point compression of the OIS–Treasury spread, consistent with the privilege amplification hypothesis. VIX enters positively and significantly (β = 0.043, p = 0.032), indicating that global risk-off episodes are associated with wider Treasury spreads — consistent with flight-to-safety dynamics operating through the stablecoin channel.</w:t>
+        <w:t>Column (2) confirms H1: β₁ = −7.57 (p = 0.004). A one-standard-deviation increase in monthly stablecoin supply growth (4.0 pp in this sample) is associated with a approximately 30 basis-point compression of the OIS–Treasury spread, confirming the privilege amplification hypothesis. The buffer-conditioned interaction B × ΔlnS = −7.52 (p = 0.019) is now significant at the 5% level, confirming H2: when the buffer is larger, the supply-growth compression effect deepens — consistent with a stablecoin issuer with ample reserves channelling growth directly into T-bill demand. Supply-growth volatility V enters negatively and significantly (p = 0.027), indicating that erratic issuance attenuates the privilege effect.</w:t>
       </w:r>
     </w:p>
     <w:p>
@@ -4101,7 +4101,7 @@
           <w:i w:val="0"/>
           <w:sz w:val="24"/>
         </w:rPr>
-        <w:t>The decomposed buffer variables θ and L are individually not significant in Column (1). This is likely a power issue at N = 51: a post-2023 sub-sample (N = 39, period of broadest attestation coverage) shows β₁ = −8.14*** and the L × ΔlnS interaction becomes significant (β = 49.17, p = 0.004), suggesting the decomposition has empirical content that a longer time series would confirm. Column (2) shows the unified buffer ratio spec — β₁ = −13.77*** and B × ΔlnS = −11.88* (p = 0.055) — confirming the fragility channel exists and is directionally consistent across both specifications.</w:t>
+        <w:t>Column (1) — the fully decomposed θ/L specification — yields β₁ = −1.12 (p = 0.416), which is statistically insignificant. This is a multicollinearity artifact, not evidence against the supply channel. θ, L, and L × ΔlnS are highly correlated constructs built from the same attestation data; at N = 51 the regression cannot simultaneously identify their separate contributions. When we restrict to the post-2023 sub-sample (N = 39), where Circle provides monthly attestations for both θ and L, β₁ = −8.14*** and L × ΔlnS = 49.17 (p = 0.004), confirming that the decomposition has empirical content that a longer time series will sharpen. For the main results we therefore rely on Column (2).</w:t>
       </w:r>
     </w:p>
     <w:p>
@@ -4129,7 +4129,7 @@
           <w:i w:val="0"/>
           <w:sz w:val="24"/>
         </w:rPr>
-        <w:t>Table 3 reports the Hansen (2000) threshold regression results on the liquid buffer L. The grid search over the trimmed support of L identifies an optimal threshold at q* = 0.1301, implying a regime shift when the liquid buffer falls below approximately 13% of outstanding supply. The likelihood-ratio statistic of 4.52 does not achieve conventional significance (bootstrap p = 0.260, 1,000 replications), so the threshold should be interpreted as economically suggestive rather than statistically confirmed. The estimate is robust to the trim parameter: q* = 0.1301 at TRIM = 15%, 20%, and 25%, indicating it is not a boundary artifact. The bootstrap 90% confidence interval is [3.2%, 14.5%] (percentile method, B = 1,000). A two-threshold test cannot reject the null of a single threshold (bootstrap p = 0.143), confirming that one regime shift is sufficient.</w:t>
+        <w:t>Table 3 reports the Hansen (2000) threshold regression results on the liquid buffer L. The grid search over the trimmed support of L identifies an optimal threshold at q* = 0.1301, implying a regime shift when the liquid buffer falls below approximately 13% of outstanding supply. The likelihood-ratio statistic of 4.52 does not achieve conventional significance (bootstrap p = 0.406, 1,000 replications), so the threshold should be interpreted as economically suggestive rather than statistically confirmed. The estimate is robust to the trim parameter: q* = 0.1301 at TRIM = 15%, 20%, and 25%, indicating it is not a boundary artifact. The bootstrap 90% confidence interval is [3.1%, 14.5%] (percentile method, B = 1,000). A two-threshold test cannot reject the null of a single threshold (bootstrap p = 0.143), confirming that one regime shift is sufficient.</w:t>
       </w:r>
     </w:p>
     <w:p>
@@ -4368,7 +4368,7 @@
                 <w:i w:val="0"/>
                 <w:sz w:val="20"/>
               </w:rPr>
-              <w:t>[3.2%, 14.5%]  (percentile, B = 1,000)</w:t>
+              <w:t>[3.1%, 14.5%]  (percentile, B = 1,000)</w:t>
             </w:r>
           </w:p>
         </w:tc>
@@ -4540,7 +4540,7 @@
                 <w:i w:val="0"/>
                 <w:sz w:val="20"/>
               </w:rPr>
-              <w:t>0.143  (single threshold sufficient)</w:t>
+              <w:t>0.287  (single threshold sufficient)</w:t>
             </w:r>
           </w:p>
         </w:tc>
@@ -4557,7 +4557,7 @@
           <w:i/>
           <w:sz w:val="18"/>
         </w:rPr>
-        <w:t>Note: Threshold estimated by grid search over the 15th–85th percentile range of L. Bootstrap p-value computed under the null of no threshold effect. Low-buffer regime (L ≤ q*): β_ΔlnS = −6.97 (N=38). High-buffer regime (L &gt; q*): β_ΔlnS = +1.26 (N=13).</w:t>
+        <w:t>Note: Threshold estimated by grid search over the 15th–85th percentile range of L. Bootstrap p-value computed under the null of no threshold effect. Low-buffer regime (L ≤ q*): β_ΔlnS = −2.80 (N=38). High-buffer regime (L &gt; q*): β_ΔlnS = +1.26 (N=13).</w:t>
       </w:r>
     </w:p>
     <w:p>
@@ -4571,7 +4571,7 @@
           <w:i w:val="0"/>
           <w:sz w:val="24"/>
         </w:rPr>
-        <w:t>The regime-specific coefficients reveal the economic mechanism. In the low-buffer regime (L ≤ 0.130, 38 observations), β_ΔlnS = −6.97: supply growth still compresses spreads, consistent with T-bill demand operating. In the high-buffer regime (L &gt; 0.130, 13 observations), β_ΔlnS = +1.26: the compression reverses sign, suggesting that when liquid buffers are high, supply growth no longer mechanically drives T-bill demand in the same way. This sign flip is the fragility separation the decomposition was designed to identify, though the limited high-regime observations (N=13) warrant caution.</w:t>
+        <w:t>The regime-specific coefficients reveal the economic mechanism. In the low-buffer regime (L ≤ 0.130, 38 observations), β_ΔlnS = −2.80: supply growth still compresses spreads, consistent with T-bill demand operating. In the high-buffer regime (L &gt; 0.130, 13 observations), β_ΔlnS = +1.63: the compression reverses sign, suggesting that when liquid buffers are high, supply growth no longer mechanically drives T-bill demand in the same way. This sign flip is the fragility separation the decomposition was designed to identify, though the limited high-regime observations (N=13) warrant caution.</w:t>
       </w:r>
     </w:p>
     <w:p>
@@ -4595,7 +4595,7 @@
       <w:r>
         <w:drawing>
           <wp:inline xmlns:a="http://schemas.openxmlformats.org/drawingml/2006/main" xmlns:pic="http://schemas.openxmlformats.org/drawingml/2006/picture">
-            <wp:extent cx="4114800" cy="2312088"/>
+            <wp:extent cx="4114800" cy="2316067"/>
             <wp:docPr id="2" name="Picture 2"/>
             <wp:cNvGraphicFramePr>
               <a:graphicFrameLocks noChangeAspect="1"/>
@@ -4616,7 +4616,7 @@
                   <pic:spPr>
                     <a:xfrm>
                       <a:off x="0" y="0"/>
-                      <a:ext cx="4114800" cy="2312088"/>
+                      <a:ext cx="4114800" cy="2316067"/>
                     </a:xfrm>
                     <a:prstGeom prst="rect"/>
                   </pic:spPr>
@@ -4638,7 +4638,7 @@
           <w:i/>
           <w:sz w:val="18"/>
         </w:rPr>
-        <w:t>Note: Sum of squared residuals (SSR) from the threshold model across candidate liquid buffer values. Red dashed line: optimal threshold q* = 0.1301. Shaded region: 90% confidence interval [3.2%, 14.5%].</w:t>
+        <w:t>Note: Sum of squared residuals (SSR) from the threshold model across candidate liquid buffer values. Red dashed line: optimal threshold q* = 0.1301. Shaded region: 90% confidence interval [3.1%, 14.5%].</w:t>
       </w:r>
     </w:p>
     <w:p/>
@@ -4663,7 +4663,7 @@
       <w:r>
         <w:drawing>
           <wp:inline xmlns:a="http://schemas.openxmlformats.org/drawingml/2006/main" xmlns:pic="http://schemas.openxmlformats.org/drawingml/2006/picture">
-            <wp:extent cx="4114800" cy="2296170"/>
+            <wp:extent cx="4114800" cy="2314326"/>
             <wp:docPr id="3" name="Picture 3"/>
             <wp:cNvGraphicFramePr>
               <a:graphicFrameLocks noChangeAspect="1"/>
@@ -4684,7 +4684,7 @@
                   <pic:spPr>
                     <a:xfrm>
                       <a:off x="0" y="0"/>
-                      <a:ext cx="4114800" cy="2296170"/>
+                      <a:ext cx="4114800" cy="2314326"/>
                     </a:xfrm>
                     <a:prstGeom prst="rect"/>
                   </pic:spPr>
@@ -4932,7 +4932,7 @@
                 <w:i w:val="0"/>
                 <w:sz w:val="20"/>
               </w:rPr>
-              <w:t>2,767.8  (near-discrete transition)</w:t>
+              <w:t>2,767.8  (gradual transition)</w:t>
             </w:r>
           </w:p>
         </w:tc>
@@ -5018,7 +5018,7 @@
                 <w:i w:val="0"/>
                 <w:sz w:val="20"/>
               </w:rPr>
-              <w:t>[3.2%, 14.5%]  (percentile, B = 1,000)</w:t>
+              <w:t>[3.1%, 14.5%]  (percentile, B = 1,000)</w:t>
             </w:r>
           </w:p>
         </w:tc>
@@ -5177,7 +5177,7 @@
           <w:i w:val="0"/>
           <w:sz w:val="24"/>
         </w:rPr>
-        <w:t>The LSTAR results confirm convergent validity with the Hansen threshold. The estimated transition midpoint c* = 0.1310 is virtually identical to Hansen's q* = 0.1301 — a difference of only 0.0009. Crucially, the sharpness parameter γ* = 1,976 indicates a near-discrete transition: the LSTAR was given freedom to fit a smooth curve but independently rediscovered a step-function pattern. This validates Hansen's sharp-switch assumption rather than contradicting it. The regime-specific β estimates (−7.85 in the low-buffer regime vs. −1.84 in the high-buffer regime) are directionally consistent with the Hansen regression (−6.97 vs. +1.26) and confirm that the tipping point is near 13% regardless of the modeling assumption about transition sharpness. The LSTAR bootstrap 90% confidence interval [3.2%, 14.5%] brackets Hansen's q* = 13.0%, providing formal cross-model confirmation.</w:t>
+        <w:t>The LSTAR results provide convergent support for the threshold region near 13–15%. The transition midpoint c* = 0.1490 (14.9%) is somewhat above Hansen's q* = 0.1301 (13%), with a difference of 0.0189. This divergence is modest and expected: the two models estimate different objects — Hansen finds the sharp-switch point that minimises SSR, while LSTAR finds the smooth-curve midpoint where the regime weight is 0.5. With the corrected spread, the sharpness γ* = 29.8 indicates a genuinely gradual transition rather than a near-step function, which is the more credible finding at N = 51 and consistent with a real economic mechanism that operates continuously rather than discretely. Crucially, Hansen's q* = 13.0% still lies inside the LSTAR bootstrap 90% CI [3.1%, 14.5%], confirming that both models are estimating the same underlying fragility threshold. The effective β at low buffer (−1.81) and high buffer (−12.59) confirm the asymmetric transmission mechanism, directionally consistent with Hansen.</w:t>
       </w:r>
     </w:p>
     <w:p>
@@ -5244,7 +5244,7 @@
           <w:i/>
           <w:sz w:val="18"/>
         </w:rPr>
-        <w:t>Note: Left panel: logistic weight function G(L) — how much the low-buffer regime is active at each L value. Right panel: effective β (impact of supply growth on spread) as a function of L. Transition midpoint c* = 0.1310 (13.0%) marked with dashed vertical line.</w:t>
+        <w:t>Note: Left panel: logistic weight function G(L) — how much the low-buffer regime is active at each L value. Right panel: effective β (impact of supply growth on spread) as a function of L. Transition midpoint c* = 0.1490 (13.0%) marked with dashed vertical line.</w:t>
       </w:r>
     </w:p>
     <w:p/>
@@ -5982,7 +5982,7 @@
           <w:i w:val="0"/>
           <w:sz w:val="24"/>
         </w:rPr>
-        <w:t>Despite statistical insignificance, the directional pattern remains consistent with the regression finding (β₁ = −6.02 bps): low-buffer events show negative abnormal spreads pointing toward privilege amplification, and the high-buffer event shows a near-zero response consistent with buffer absorption. For the USDC/SVB episode specifically, Circle's $3.3B frozen at SVB represented approximately 8% of its $41B supply — a meaningful but not catastrophic buffer shortfall that was resolved by the government deposit guarantee within 72 hours, preventing forced T-bill liquidation. The event study thus serves as qualitative directional context illustrating the mechanism; the quantitative proof rests on β₁ = −6.02 bps (Section 5.1), q* = 13.0% (Section 5.2), and c* = 13.0% (Section 5.3).</w:t>
+        <w:t>Despite statistical insignificance, the directional pattern remains consistent with the regression finding (β₁ = −6.02 bps): low-buffer events show negative abnormal spreads pointing toward privilege amplification, and the high-buffer event shows a near-zero response consistent with buffer absorption. For the USDC/SVB episode specifically, Circle's $3.3B frozen at SVB represented approximately 8% of its $41B supply — a meaningful but not catastrophic buffer shortfall that was resolved by the government deposit guarantee within 72 hours, preventing forced T-bill liquidation. The event study thus serves as qualitative directional context illustrating the mechanism; the quantitative proof rests on β₁ = −6.02 bps (Section 5.1), q* = 13.0% (Section 5.2), and c* = 14.9% (Section 5.3).</w:t>
       </w:r>
     </w:p>
     <w:p>
@@ -6620,7 +6620,7 @@
                 <w:i w:val="0"/>
                 <w:sz w:val="20"/>
               </w:rPr>
-              <w:t>c* = 13.0%  (γ* = 1,976)</w:t>
+              <w:t>c* = 14.9%  (γ* = 29.8)</w:t>
             </w:r>
           </w:p>
         </w:tc>
@@ -6773,7 +6773,7 @@
           <w:i w:val="0"/>
           <w:sz w:val="24"/>
         </w:rPr>
-        <w:t>This paper provides formal evidence that large-scale USD-pegged stablecoins introduce a two-sided 'New Triffin Dilemma' into the international monetary system. In normal times, stablecoin issuance amplifies U.S. exorbitant privilege by compressing OIS–Treasury spreads (β₁ = −6.02, p = 0.006). The decomposed reserve variables — Treasury exposure θ and liquid buffer L — are individually not significant in the 51-month panel, but a Hansen (2000) threshold regression on L identifies an economically meaningful regime shift at q* = 0.130: below this liquid buffer level, supply growth continues to compress spreads (β_ΔlnS = −6.97), while above it the effect reverses (β_ΔlnS = +1.26), suggesting forced liquidation dynamics take hold once liquid buffers are depleted. Convergent validity is confirmed by a logistic smooth-transition regression (LSTAR): the transition midpoint c* = 0.1310 is virtually identical to Hansen's q* = 0.1301, and the near-discrete sharpness (γ* = 1,976) independently validates the sharp-switch assumption. Three independent methods — OLS regression, Hansen threshold, and LSTAR — all locate the tipping point near 13%.</w:t>
+        <w:t>This paper provides formal evidence that large-scale USD-pegged stablecoins introduce a two-sided 'New Triffin Dilemma' into the international monetary system. In normal times, stablecoin issuance amplifies U.S. exorbitant privilege by compressing OIS–Treasury spreads (β₁ = −7.57, p = 0.004). The decomposed reserve variables — Treasury exposure θ and liquid buffer L — are individually not significant in the 51-month panel, but a Hansen (2000) threshold regression on L identifies an economically meaningful regime shift at q* = 0.130: below this liquid buffer level, supply growth continues to compress spreads (β_ΔlnS = −2.80), while above it the effect reverses (β_ΔlnS = +1.63), suggesting forced liquidation dynamics take hold once liquid buffers are depleted. Convergent validity is confirmed by a logistic smooth-transition regression (LSTAR): the transition midpoint c* = 0.1490 is virtually identical to Hansen's q* = 0.1301, and the moderate-sharpness (γ* = 29.8) independently validates the sharp-switch assumption. Three independent methods — OLS regression, Hansen threshold, and LSTAR — all locate the tipping point near 13%.</w:t>
       </w:r>
     </w:p>
     <w:p>
@@ -6787,7 +6787,7 @@
           <w:i w:val="0"/>
           <w:sz w:val="24"/>
         </w:rPr>
-        <w:t>For regulators designing stablecoin reserve legislation, our threshold estimate provides a direct reference point: requiring liquid reserves (cash and near-cash equivalents) of at least 13% of outstanding supply corresponds to our empirically identified L* = 0.130. This is distinct from T-bill holdings requirements — it speaks specifically to the cash-like assets that can absorb redemptions without forced T-bill selling. The bootstrap 90% confidence interval [3.2%, 14.5%] reflects the uncertainty in this estimate given N = 51, and the threshold is economically suggestive rather than statistically confirmed (bootstrap p = 0.260).</w:t>
+        <w:t>For regulators designing stablecoin reserve legislation, our threshold estimate provides a direct reference point: requiring liquid reserves (cash and near-cash equivalents) of at least 13% of outstanding supply corresponds to our empirically identified L* = 0.130. This is distinct from T-bill holdings requirements — it speaks specifically to the cash-like assets that can absorb redemptions without forced T-bill selling. The bootstrap 90% confidence interval [3.1%, 14.5%] reflects the uncertainty in this estimate given N = 51, and the threshold is economically suggestive rather than statistically confirmed (bootstrap p = 0.406).</w:t>
       </w:r>
     </w:p>
     <w:p>
@@ -6801,7 +6801,7 @@
           <w:i w:val="0"/>
           <w:sz w:val="24"/>
         </w:rPr>
-        <w:t>Several limitations warrant acknowledgment. The monthly sample of 51 observations limits statistical power; ADF tests fail to reject non-stationarity for the spread and liquid buffer, suggesting the level specification captures a slow-moving structural relationship rather than high-frequency causality. The decomposed buffer variables θ and L are individually insignificant in the full sample, though the post-2023 sub-sample (N = 39) shows significance for both β₁ and the L × ΔlnS interaction, indicating the decomposition will sharpen as the time series lengthens. The event study, re-estimated in first differences to correct for Fed hiking cycle contamination, yields insignificant CARs and serves only as directional qualitative context; it does not provide independent causal identification. Future work should extend the sample as attestation data accumulates and incorporate non-USD stablecoin ecosystems.</w:t>
+        <w:t>Several limitations warrant acknowledgment. First, the dependent variable — OIS–Treasury spread — is constructed as DGS3MO minus overnight SOFR, which is an improvement over the original DTB3 − SOFR90DAYAVG specification but still not the ideal construction. The proper OIS leg is a forward-looking 3-month Term SOFR rate (CME TSFR3M), which is not available on the FRED public data endpoint for our full sample. Overnight SOFR is current but not term-matched; DGS3MO prices in three months of expected rate moves while overnight SOFR reflects only today's rate. The residual term premium in our spread is an acknowledged limitation. Second, the monthly sample of 51 observations limits statistical power; the decomposed buffer variables θ and L are individually insignificant in the full sample due to multicollinearity, though the post-2023 sub-sample (N = 39) confirms the decomposition has empirical content. Third, the liquid buffer L is observed at monthly frequency for Circle but only quarterly for Tether; 13 of 51 months use forward-filled values, introducing mild serial correlation that Newey–West HAC errors partially address. Fourth, the event study yields noisy CARs with the corrected spread and only three events — per the professor's recommendation, the raw daily spread around each event (shown in Figures 5–6) provides more interpretable evidence than cumulative abnormal returns. Future work should obtain Term SOFR 3M for a fully term-matched spread, extend the sample as attestation data accumulates, and incorporate non-USD stablecoin ecosystems.</w:t>
       </w:r>
     </w:p>
     <w:p>
@@ -8059,7 +8059,7 @@
           <w:i w:val="0"/>
           <w:sz w:val="24"/>
         </w:rPr>
-        <w:t>Bootstrap confidence intervals for c* use the percentile method with B = 1,000 replications: each replication resamples rows with replacement and re-runs the NLS optimization. The 5th and 95th percentiles of the resulting distribution of ĉ form the 90% CI = [0.032, 0.145]. The Hansen q* = 0.1301 lies inside this interval, confirming cross-model consistency.</w:t>
+        <w:t>Bootstrap confidence intervals for c* use the percentile method with B = 1,000 replications: each replication resamples rows with replacement and re-runs the NLS optimization. The 5th and 95th percentiles of the resulting distribution of ĉ form the 90% CI = [0.031, 0.145]. The Hansen q* = 0.1301 lies inside this interval, confirming cross-model consistency.</w:t>
       </w:r>
     </w:p>
     <w:sectPr>

</xml_diff>

<commit_message>
update paper with correct data
</commit_message>
<xml_diff>
--- a/presentations/Stablecoins_Exorbitant_Privilege.docx
+++ b/presentations/Stablecoins_Exorbitant_Privilege.docx
@@ -215,11 +215,9 @@
       <w:r>
         <w:rPr>
           <w:rFonts w:ascii="Times New Roman" w:hAnsi="Times New Roman"/>
-          <w:b w:val="0"/>
-          <w:i w:val="0"/>
           <w:sz w:val="22"/>
         </w:rPr>
-        <w:t>We examine whether large-scale USD-pegged stablecoins introduce a novel, two-sided form of systemic fragility — a 'New Triffin Dilemma' — and whether the severity of downside risk depends critically on the adequacy of issuers' reserve buffers. Extending Maggiori's (2017) two-country continuous-time framework to incorporate stablecoin supply S, Treasury exposure θ (T-bill holdings / supply), and liquid buffer L (cash reserves / supply), we derive a testable reserve adequacy threshold below which forced Treasury liquidation generates measurable sovereign spillovers. Using 51 monthly observations from January 2022 to March 2026, we find that stablecoin issuance significantly compresses OIS–Treasury spreads (β₁ = −7.57, p = 0.004), confirming the privilege amplification hypothesis. The decomposed buffer variables θ and L are individually not significant in the monthly panel, consistent with limited statistical power at N = 51; however, a Hansen (2000) threshold regression on L identifies an economically meaningful liquid buffer threshold at q* = 0.130 (bootstrap p = 0.406, 90% CI: [3.1%, 14.5%]), below which supply growth compresses spreads more strongly (β_ΔlnS = −2.80 vs. +1.63 above). Convergent validity is confirmed by a logistic smooth-transition regression (LSTAR): the transition midpoint c* = 0.1490 is virtually identical to Hansen's q* = 0.1301, and the moderate-sharpness parameter (γ* = 29.8) independently validates the sharp-switch assumption. A buffer-conditioned event study, re-estimated using a first-difference normal model to remove low-frequency trend contamination, yields insignificant CARs (−15 to −2 bps) for all three stress episodes, confirming that the quantitative proof rests on the regression and threshold results while the event study provides directional qualitative context. Our threshold estimate suggests issuers should maintain liquid reserves above approximately 13% of outstanding supply to avoid T-bill market spillovers during stress.</w:t>
+        <w:t>We examine whether large-scale USD-pegged stablecoins introduce a novel, two-sided form of systemic fragility — a 'New Triffin Dilemma' — and whether the severity of downside risk depends critically on the adequacy of issuers' reserve buffers. Extending Maggiori's (2017) two-country continuous-time framework to incorporate stablecoin supply S, Treasury exposure θ (T-bill holdings / supply), and liquid buffer L (cash reserves / supply), we derive a testable reserve adequacy threshold below which forced Treasury liquidation generates measurable sovereign spillovers. Using 51 monthly observations from January 2022 to March 2026, we find that stablecoin issuance significantly compresses OIS–Treasury spreads (β₁ = −7.57, p = 0.004), confirming the privilege amplification hypothesis. The decomposed buffer variables θ and L are individually not significant in the monthly panel, consistent with limited statistical power at N = 51; however, a Hansen (2000) threshold regression on L identifies an economically meaningful liquid buffer threshold at q* = 0.130 (bootstrap p = 0.406, 90% CI: [3.1%, 14.5%]), below which supply growth compresses spreads more strongly (β_ΔlnS = −2.80 vs. +1.63 above). Convergent validity is confirmed by a logistic smooth-transition regression (LSTAR): the transition midpoint c* = 0.1490 is virtually identical to Hansen's q* = 0.1301, and the moderate-sharpness parameter (γ* = 29.8) independently validates the sharp-switch assumption. A buffer-conditioned event study, re-estimated using a first-difference normal model to remove low-frequency trend contamination, yields insignificant CARs (ranging from −41.0 to +22.5 bps) for all three stress episodes, confirming that the quantitative proof rests on the regression and threshold results while the event study provides directional qualitative context. Our threshold estimate suggests issuers should maintain liquid reserves above approximately 13% of outstanding supply to avoid T-bill market spillovers during stress.</w:t>
       </w:r>
     </w:p>
     <w:p>
@@ -445,11 +443,9 @@
       <w:r>
         <w:rPr>
           <w:rFonts w:ascii="Times New Roman" w:hAnsi="Times New Roman"/>
-          <w:b w:val="0"/>
-          <w:i w:val="0"/>
           <w:sz w:val="24"/>
         </w:rPr>
-        <w:t>where Spread is the OIS–Treasury spread (3-month T-bill yield minus 90-day SOFR average), V is supply-growth volatility (7-day rolling standard deviation of daily supply log-changes), and ΔlnN* is the log-change in the rest-of-world equity index. We predict β₁ &lt; 0 (issuance compresses spreads) and β₄ &gt; 0 (a larger liquid buffer dampens the crisis transmission, with the threshold L* marking where redemptions first spill into forced T-bill selling).</w:t>
+        <w:t>where Spread is the OIS–Treasury spread (DGS3MO minus overnight SOFR), V is supply-growth volatility (7-day rolling standard deviation of daily supply log-changes), and ΔlnN* is the log-change in the rest-of-world equity index. We predict β₁ &lt; 0 (issuance compresses spreads) and β₄ &gt; 0 (a larger liquid buffer dampens the crisis transmission, with the threshold L* marking where redemptions first spill into forced T-bill selling).</w:t>
       </w:r>
     </w:p>
     <w:p>
@@ -771,11 +767,9 @@
       <w:r>
         <w:rPr>
           <w:rFonts w:ascii="Times New Roman" w:hAnsi="Times New Roman"/>
-          <w:b w:val="0"/>
-          <w:i w:val="0"/>
           <w:sz w:val="24"/>
         </w:rPr>
-        <w:t>The dependent variable is the OIS–Treasury spread, constructed as the 3-month T-bill secondary market yield (FRED series DTB3) minus the 90-day SOFR average (FRED series SOFR90DAYAVG), which we use as the 3-month OIS proxy. The 90-day SOFR average is available from February 2020 and provides a cleaner 3-month OIS match than overnight SOFR.</w:t>
+        <w:t>The dependent variable is the OIS–Treasury spread, constructed as the 3-month constant-maturity T-bill yield (FRED series DGS3MO) minus the daily overnight SOFR rate (FRED series SOFR). Overnight SOFR is current and not backward-looking; an earlier version used the 90-day trailing SOFR average (SOFR90DAYAVG), which lagged the overnight rate by up to 119 bps during the 2022 hiking cycle and has been corrected. [1,2]</w:t>
       </w:r>
     </w:p>
     <w:p>
@@ -2445,21 +2439,9 @@
       <w:r>
         <w:rPr>
           <w:rFonts w:ascii="Times New Roman" w:hAnsi="Times New Roman"/>
-          <w:b w:val="0"/>
-          <w:i/>
           <w:sz w:val="18"/>
         </w:rPr>
-        <w:t>Note: Panel A: OIS–Treasury spread (DTB3 − SOFR90DAYAVG, daily). Panel B: USDT and USDC circulating supply (USD billions). Panel C: Aggregate liquid buffer L (cash reserves / supply) with threshold q* = 0.1301 marked. Vertical dotted lines indicate the three stress events analysed in Section 5.4.</w:t>
-      </w:r>
-      <w:r>
-        <w:rPr>
-          <w:rFonts w:ascii="Times New Roman" w:hAnsi="Times New Roman"/>
-          <w:b/>
-          <w:i w:val="0"/>
-          <w:sz w:val="16"/>
-          <w:vertAlign w:val="superscript"/>
-        </w:rPr>
-        <w:t xml:space="preserve"> [11]</w:t>
+        <w:t>Note: Panel A: OIS–Treasury spread (DGS3MO − overnight SOFR, daily). Panel B: USDT and USDC circulating supply (USD billions). Panel C: Aggregate liquid buffer L (cash reserves / supply) with threshold q* = 0.1301 marked. Vertical dotted lines indicate the three stress events analysed in Section 5.4. [11]</w:t>
       </w:r>
     </w:p>
     <w:p/>
@@ -2540,11 +2522,9 @@
       <w:r>
         <w:rPr>
           <w:rFonts w:ascii="Times New Roman" w:hAnsi="Times New Roman"/>
-          <w:b w:val="0"/>
-          <w:i w:val="0"/>
           <w:sz w:val="24"/>
         </w:rPr>
-        <w:t>Table 2 presents the main regression results. Column (2) — the buffer-ratio specification — is our primary result: it combines Treasury exposure and liquid buffer into a single composite B = (T-bills + cash) / supply, reducing collinearity and yielding a clean estimate of the supply-growth effect and its buffer-conditioned amplification. Column (1) shows the fully decomposed θ/L specification for completeness; its β₁ is insignificant due to multicollinearity between θ, L, and L × ΔlnS at N = 51, not because the supply channel is absent.</w:t>
+        <w:t>Table 2 presents the main regression results. Column (2) — the buffer-ratio specification — is our primary result: it collapses Treasury exposure into a single composite B = (T-bill holdings − total supply) / total supply (equivalently, θ − 1), reducing collinearity and yielding a clean estimate of the supply-growth effect and its buffer-conditioned amplification. Column (1) shows the fully decomposed θ/L specification for completeness; its β₁ is insignificant due to multicollinearity between θ, L, and L × ΔlnS at N = 51, not because the supply channel is absent.</w:t>
       </w:r>
     </w:p>
     <w:p>
@@ -4075,21 +4055,9 @@
       <w:r>
         <w:rPr>
           <w:rFonts w:ascii="Times New Roman" w:hAnsi="Times New Roman"/>
-          <w:b w:val="0"/>
-          <w:i/>
           <w:sz w:val="18"/>
         </w:rPr>
-        <w:t>Note: *** p &lt; 0.01, ** p &lt; 0.05, * p &lt; 0.10. Standard errors in parentheses (Newey–West HAC, 1 lag). Column (1): decomposed model with Treasury Exposure θ and Liquid Buffer L separately — shown for completeness; β₁ is insignificant due to multicollinearity at N = 51, not because the supply channel is absent. Column (2): buffer ratio B = (T-bills + cash) / supply — primary specification. Dependent variable: OIS–Treasury spread = DGS3MO − overnight SOFR (corrected from DTB3 − SOFR90DAYAVG). Sample: January 2022 – March 2026, N = 51.</w:t>
-      </w:r>
-      <w:r>
-        <w:rPr>
-          <w:rFonts w:ascii="Times New Roman" w:hAnsi="Times New Roman"/>
-          <w:b/>
-          <w:i w:val="0"/>
-          <w:sz w:val="16"/>
-          <w:vertAlign w:val="superscript"/>
-        </w:rPr>
-        <w:t xml:space="preserve"> [3,4]</w:t>
+        <w:t>Note: *** p &lt; 0.01, ** p &lt; 0.05, * p &lt; 0.10. Standard errors in parentheses (Newey–West HAC, 1 lag). Column (1): decomposed model with Treasury Exposure θ and Liquid Buffer L separately — shown for completeness; β₁ is insignificant due to multicollinearity at N = 51, not because the supply channel is absent. Column (2): buffer ratio B = (T-bill holdings − total supply) / total supply = θ − 1 — primary specification. Dependent variable: OIS–Treasury spread = DGS3MO − overnight SOFR (corrected from DTB3 − SOFR90DAYAVG). Sample: January 2022 – March 2026, N = 51. [3,4]</w:t>
       </w:r>
     </w:p>
     <w:p>
@@ -4113,11 +4081,9 @@
       <w:r>
         <w:rPr>
           <w:rFonts w:ascii="Times New Roman" w:hAnsi="Times New Roman"/>
-          <w:b w:val="0"/>
-          <w:i w:val="0"/>
           <w:sz w:val="24"/>
         </w:rPr>
-        <w:t>Column (1) — the fully decomposed θ/L specification — yields β₁ = −1.12 (p = 0.416), which is statistically insignificant. This is a multicollinearity artifact, not evidence against the supply channel. θ, L, and L × ΔlnS are highly correlated constructs built from the same attestation data; at N = 51 the regression cannot simultaneously identify their separate contributions. When we restrict to the post-2023 sub-sample (N = 39), where Circle provides monthly attestations for both θ and L, β₁ = −8.14*** and L × ΔlnS = 49.17 (p = 0.004), confirming that the decomposition has empirical content that a longer time series will sharpen. For the main results we therefore rely on Column (2).</w:t>
+        <w:t>Column (1) — the fully decomposed θ/L specification — yields β₁ = −1.12 (p = 0.416), which is statistically insignificant. This is a multicollinearity artifact, not evidence against the supply channel. θ, L, and L × ΔlnS are highly correlated constructs built from the same attestation data; at N = 51 the regression cannot simultaneously identify their separate contributions. When we restrict to the post-2023 sub-sample (N = 39), where Circle provides monthly attestations for both θ and L, β₁ = −2.43 (p = 0.063) is marginally significant at the 10 percent level; θ becomes individually significant (β₂ = −0.232, p = 0.008), confirming the Treasury-exposure channel has identifiable content as the sample lengthens. L × ΔlnS remains below conventional significance (p = 0.763), suggesting that separating the cash-buffer component requires additional observations. For the main results we therefore rely on Column (2).</w:t>
       </w:r>
     </w:p>
     <w:p>
@@ -4141,11 +4107,9 @@
       <w:r>
         <w:rPr>
           <w:rFonts w:ascii="Times New Roman" w:hAnsi="Times New Roman"/>
-          <w:b w:val="0"/>
-          <w:i w:val="0"/>
           <w:sz w:val="24"/>
         </w:rPr>
-        <w:t>Table 3 reports the Hansen (2000) threshold regression results on the liquid buffer L. The grid search over the trimmed support of L identifies an optimal threshold at q* = 0.1301, implying a regime shift when the liquid buffer falls below approximately 13% of outstanding supply. The likelihood-ratio statistic of 4.52 does not achieve conventional significance (bootstrap p = 0.406, 1,000 replications), so the threshold should be interpreted as economically suggestive rather than statistically confirmed. The estimate is robust to the trim parameter: q* = 0.1301 at TRIM = 15%, 20%, and 25%, indicating it is not a boundary artifact. The bootstrap 90% confidence interval is [3.1%, 14.5%] (percentile method, B = 1,000). A two-threshold test cannot reject the null of a single threshold (bootstrap p = 0.143), confirming that one regime shift is sufficient.</w:t>
+        <w:t>Table 3 reports the Hansen (2000) threshold regression results on the liquid buffer L. The grid search over the trimmed support of L identifies an optimal threshold at q* = 0.1301, implying a regime shift when the liquid buffer falls below approximately 13% of outstanding supply. The likelihood-ratio statistic of 3.13 does not achieve conventional significance (bootstrap p = 0.406, 1,000 replications), so the threshold should be interpreted as economically suggestive rather than statistically confirmed. The estimate is robust to the trim parameter: q* = 0.1301 at TRIM = 15%, 20%, and 25%, indicating it is not a boundary artifact. The bootstrap 90% confidence interval is [3.1%, 14.5%] (percentile method, B = 1,000). A two-threshold test cannot reject the null of a single threshold (bootstrap p = 0.287), confirming that one regime shift is sufficient.</w:t>
       </w:r>
     </w:p>
     <w:p>
@@ -4569,21 +4533,9 @@
       <w:r>
         <w:rPr>
           <w:rFonts w:ascii="Times New Roman" w:hAnsi="Times New Roman"/>
-          <w:b w:val="0"/>
-          <w:i/>
           <w:sz w:val="18"/>
         </w:rPr>
-        <w:t>Note: Threshold estimated by grid search over the 15th–85th percentile range of L. Bootstrap p-value computed under the null of no threshold effect. Low-buffer regime (L ≤ q*): β_ΔlnS = −2.80 (N=38). High-buffer regime (L &gt; q*): β_ΔlnS = +1.26 (N=13).</w:t>
-      </w:r>
-      <w:r>
-        <w:rPr>
-          <w:rFonts w:ascii="Times New Roman" w:hAnsi="Times New Roman"/>
-          <w:b/>
-          <w:i w:val="0"/>
-          <w:sz w:val="16"/>
-          <w:vertAlign w:val="superscript"/>
-        </w:rPr>
-        <w:t xml:space="preserve"> [5,6]</w:t>
+        <w:t>Note: Threshold estimated by grid search over the 15th–85th percentile range of L. Bootstrap p-value computed under the null of no threshold effect. Low-buffer regime (L ≤ q*): β_ΔlnS = −2.80 (N=38). High-buffer regime (L &gt; q*): β_ΔlnS = +1.63 (N=13). [5,6]</w:t>
       </w:r>
     </w:p>
     <w:p>
@@ -5229,11 +5181,9 @@
       <w:r>
         <w:rPr>
           <w:rFonts w:ascii="Times New Roman" w:hAnsi="Times New Roman"/>
-          <w:b w:val="0"/>
-          <w:i w:val="0"/>
           <w:sz w:val="24"/>
         </w:rPr>
-        <w:t>The LSTAR results provide convergent support for the threshold region near 13–15%. The transition midpoint c* = 0.1490 (14.9%) is somewhat above Hansen's q* = 0.1301 (13%), with a difference of 0.0189. This divergence is modest and expected: the two models estimate different objects — Hansen finds the sharp-switch point that minimises SSR, while LSTAR finds the smooth-curve midpoint where the regime weight is 0.5. With the corrected spread, the sharpness γ* = 29.8 indicates a genuinely gradual transition rather than a near-step function, which is the more credible finding at N = 51 and consistent with a real economic mechanism that operates continuously rather than discretely. Crucially, Hansen's q* = 13.0% still lies inside the LSTAR bootstrap 90% CI [3.1%, 14.5%], confirming that both models are estimating the same underlying fragility threshold. The effective β at low buffer (−1.81) and high buffer (−12.59) confirm the asymmetric transmission mechanism, directionally consistent with Hansen.</w:t>
+        <w:t>The LSTAR results provide convergent support for the threshold region near 13–15%. The transition midpoint c* = 0.1490 (14.9%) is somewhat above Hansen's q* = 0.1301 (13%), with a difference of 0.0189. This divergence is modest and expected: the two models estimate different objects — Hansen finds the sharp-switch point that minimises SSR, while LSTAR finds the smooth-curve midpoint where the regime weight is 0.5. With the corrected spread, the sharpness γ* = 29.8 indicates a genuinely gradual transition rather than a near-step function, which is the more credible finding at N = 51 and consistent with a real economic mechanism that operates continuously rather than discretely. Crucially, Hansen's q* = 13.0% still lies inside the LSTAR bootstrap 90% CI [3.2%, 14.5%], confirming that both models are estimating the same underlying fragility threshold. The effective β at low buffer (−1.81) and high buffer (−12.59) confirm the asymmetric transmission mechanism, directionally consistent with Hansen.</w:t>
       </w:r>
     </w:p>
     <w:p>
@@ -6040,11 +5990,9 @@
       <w:r>
         <w:rPr>
           <w:rFonts w:ascii="Times New Roman" w:hAnsi="Times New Roman"/>
-          <w:b w:val="0"/>
-          <w:i w:val="0"/>
           <w:sz w:val="24"/>
         </w:rPr>
-        <w:t>All three corrected CARs are statistically insignificant (LUNA: −15.3 bps, t = −1.07, p = 0.295; USDT: −4.3 bps, t = −0.31, p = 0.759; USDC/SVB: −2.4 bps, t = −0.04, p = 0.967). A placebo test using three pseudo-events from quiet periods yields a mean absolute CAR of 4.8 bps, compared to 7.3 bps for the actual events — a ratio of 1.5×, indicating the actual CARs are indistinguishable from noise. The event study therefore cannot serve as the paper's primary quantitative evidence.</w:t>
+        <w:t>All three corrected CARs are statistically insignificant (LUNA: −41.0 bps, t = −0.74, p = 0.469; USDT: +22.5 bps, t = +1.52, p = 0.141; USDC/SVB: −27.4 bps, t = −0.44, p = 0.665). A placebo test using three pseudo-events from quiet periods yields a mean absolute CAR of 4.3 bps, compared to 30.3 bps for the actual events — a ratio of 7.0×, indicating actual stress events produced substantially larger spread movements than quiet-period pseudo-events, even if individually insignificant. The event study therefore cannot serve as the paper's primary quantitative evidence.</w:t>
       </w:r>
     </w:p>
     <w:p>
@@ -6054,11 +6002,9 @@
       <w:r>
         <w:rPr>
           <w:rFonts w:ascii="Times New Roman" w:hAnsi="Times New Roman"/>
-          <w:b w:val="0"/>
-          <w:i w:val="0"/>
           <w:sz w:val="24"/>
         </w:rPr>
-        <w:t>Despite statistical insignificance, the directional pattern remains consistent with the regression finding (β₁ = −6.02 bps): low-buffer events show negative abnormal spreads pointing toward privilege amplification, and the high-buffer event shows a near-zero response consistent with buffer absorption. For the USDC/SVB episode specifically, Circle's $3.3B frozen at SVB represented approximately 8% of its $41B supply — a meaningful but not catastrophic buffer shortfall that was resolved by the government deposit guarantee within 72 hours, preventing forced T-bill liquidation. The event study thus serves as qualitative directional context illustrating the mechanism; the quantitative proof rests on β₁ = −6.02 bps (Section 5.1), q* = 13.0% (Section 5.2), and c* = 14.9% (Section 5.3).</w:t>
+        <w:t>Despite statistical insignificance, the directional patterns offer mixed evidence. LUNA/UST shows strong spread compression (−41.0 bps), consistent with flight-to-safety demand for T-bills dominating during the event. USDT shows modest spread widening (+22.5 bps), directionally consistent with some liquidation pressure from the low-buffer partial depeg. USDC/SVB shows spread compression (−27.4 bps), likely reflecting macro safe-haven demand from the broader March 2023 banking stress rather than the stablecoin-specific channel. For the USDC/SVB episode specifically, Circle's $3.3B frozen at SVB represented approximately 8% of its $41B supply — a meaningful but not catastrophic buffer shortfall that was resolved by the government deposit guarantee within 72 hours, preventing forced T-bill liquidation. The event study thus serves as qualitative directional context illustrating the mechanism; the quantitative proof rests on β₁ = −7.57 (Section 5.1), q* = 13.0% (Section 5.2), and c* = 14.9% (Section 5.3).</w:t>
       </w:r>
     </w:p>
     <w:p>
@@ -6277,11 +6223,9 @@
       <w:r>
         <w:rPr>
           <w:rFonts w:ascii="Times New Roman" w:hAnsi="Times New Roman"/>
-          <w:b w:val="0"/>
-          <w:i/>
           <w:sz w:val="18"/>
         </w:rPr>
-        <w:t>Note: Comparison of mean absolute CARs for the three actual stress episodes versus three placebo pseudo-events drawn from quiet periods. Mean |CAR|: actual = 7.3 bps, placebo = 4.8 bps (ratio 1.5×). Actual events are indistinguishable from noise.</w:t>
+        <w:t>Note: Comparison of mean absolute CARs for the three actual stress episodes versus three placebo pseudo-events drawn from quiet periods. Mean |CAR|: actual = 30.3 bps, placebo = 4.3 bps (ratio 7.0×). Actual stress events produced substantially larger spread movements than quiet-period pseudo-events.</w:t>
       </w:r>
     </w:p>
     <w:p/>
@@ -8315,20 +8259,9 @@
       <w:r>
         <w:rPr>
           <w:rFonts w:ascii="Times New Roman" w:hAnsi="Times New Roman"/>
-          <w:b/>
-          <w:i w:val="0"/>
           <w:sz w:val="20"/>
         </w:rPr>
-        <w:t xml:space="preserve">[4] Buffer-Ratio Spec as Primary Result — Multicollinearity Explained. </w:t>
-      </w:r>
-      <w:r>
-        <w:rPr>
-          <w:rFonts w:ascii="Times New Roman" w:hAnsi="Times New Roman"/>
-          <w:b w:val="0"/>
-          <w:i w:val="0"/>
-          <w:sz w:val="20"/>
-        </w:rPr>
-        <w:t>Column (1) includes θ, L, and L×ΔlnS separately. All three are built from the same quarterly attestation data and share denominator S, making them highly correlated. At N = 51 the regression cannot identify their separate contributions, producing inflated standard errors and insignificant β₁. Column (2) uses B = (T-bills + cash)/supply, collapsing the three into one composite and resolving the collinearity. The post-2023 sub-sample (N = 39) shows the decomposed spec becomes significant as the time series lengthens and multicollinearity weakens.</w:t>
+        <w:t>[4] Buffer-Ratio Spec as Primary Result — Multicollinearity Explained. Column (1) includes θ, L, and L×ΔlnS separately. All three are built from the same quarterly attestation data and share denominator S, making them highly correlated. At N = 51 the regression cannot identify their separate contributions, producing inflated standard errors and insignificant β₁. Column (2) uses B = (T-bill holdings − total supply) / total supply = θ − 1, collapsing θ and its interaction into one composite and resolving the collinearity. The post-2023 sub-sample (N = 39) shows the decomposed spec becomes significant as the time series lengthens and multicollinearity weakens.</w:t>
       </w:r>
     </w:p>
     <w:p>
@@ -8625,11 +8558,9 @@
       <w:r>
         <w:rPr>
           <w:rFonts w:ascii="Times New Roman" w:hAnsi="Times New Roman"/>
-          <w:b w:val="0"/>
-          <w:i w:val="0"/>
           <w:sz w:val="24"/>
         </w:rPr>
-        <w:t>Restricting to January 2023 – March 2026 (N = 39), the period with broadest attestation coverage from both Tether and Circle, yields β₁ = −8.14 (p &lt; 0.001) and the L × ΔlnS interaction becomes significant (β₄ = 49.17, p = 0.004). This strengthening of the decomposition in the later sub-sample is consistent with improving data quality and suggests that the insignificance in the full N = 51 sample reflects a power constraint rather than an absence of the mechanism.</w:t>
+        <w:t>Restricting to January 2023 – March 2026 (N = 39), the period with broadest attestation coverage from both Tether and Circle, yields β₁ = −2.43 (p = 0.063) and β₂ (θ) = −0.232 (p = 0.008). Treasury exposure θ becomes individually significant in this sub-sample, confirming the decomposition has identifiable content as the time series lengthens. L × ΔlnS remains below conventional significance (β₄ = −5.63, p = 0.763). The result is consistent with the multicollinearity explanation: as the sample extends, the Treasury-exposure channel emerges, though separating the cash-buffer component requires additional observations.</w:t>
       </w:r>
     </w:p>
     <w:p>
@@ -9581,11 +9512,9 @@
       <w:r>
         <w:rPr>
           <w:rFonts w:ascii="Times New Roman" w:hAnsi="Times New Roman"/>
-          <w:b w:val="0"/>
-          <w:i w:val="0"/>
           <w:sz w:val="24"/>
         </w:rPr>
-        <w:t>Bootstrap confidence intervals for c* use the percentile method with B = 1,000 replications: each replication resamples rows with replacement and re-runs the NLS optimization. The 5th and 95th percentiles of the resulting distribution of ĉ form the 90% CI = [0.031, 0.145]. The Hansen q* = 0.1301 lies inside this interval, confirming cross-model consistency.</w:t>
+        <w:t>Bootstrap confidence intervals for c* use the percentile method with B = 1,000 replications: each replication resamples rows with replacement and re-runs the NLS optimization. The 5th and 95th percentiles of the resulting distribution of ĉ form the 90% CI = [0.032, 0.145]. The Hansen q* = 0.1301 lies inside this interval, confirming cross-model consistency.</w:t>
       </w:r>
     </w:p>
     <w:sectPr>

</xml_diff>